<commit_message>
Fix PDF display in downloaded reports + improve media handling
- PDFs uploaded via Images dropzone now appear in Images section of reports
- Added PDF link display in report template with blue underlined text
- Updated add_image_to_paragraph to detect and handle PDFs separately
- Added new row to Word template for standalone PDF sections if needed
- Simplified PDF link function to use basic python-docx formatting
- PDFs now show filename + URL reference for easy access

This completes PDF report embedding functionality. PDFs display as:
- Clickable links in Images section (when uploaded via images box)
- Separate PDF links in Drawings section (if added separately)

Co-Authored-By: Claude Haiku 4.5 <noreply@anthropic.com>
</commit_message>
<xml_diff>
--- a/public/Survey_Report_Template.docx
+++ b/public/Survey_Report_Template.docx
@@ -1513,6 +1513,28 @@
           </w:p>
         </w:tc>
       </w:tr>
+      <w:tr>
+        <w:tc>
+          <w:tcPr>
+            <w:tcW w:type="dxa" w:w="11335"/>
+          </w:tcPr>
+          <w:p>
+            <w:r>
+              <w:t>Drawings/PDFs</w:t>
+            </w:r>
+          </w:p>
+        </w:tc>
+        <w:tc>
+          <w:tcPr>
+            <w:tcW w:type="dxa" w:w="4207"/>
+          </w:tcPr>
+          <w:p>
+            <w:r>
+              <w:t>{{Item.PDFs}}</w:t>
+            </w:r>
+          </w:p>
+        </w:tc>
+      </w:tr>
     </w:tbl>
     <w:p/>
     <w:p>

</xml_diff>